<commit_message>
Esqueci-me de falar da Leaderboard
</commit_message>
<xml_diff>
--- a/Relatorio.docx
+++ b/Relatorio.docx
@@ -5339,8 +5339,8 @@
       <w:bookmarkStart w:id="1" w:name="_Toc180278165"/>
       <w:bookmarkStart w:id="2" w:name="_Toc180278408"/>
       <w:bookmarkStart w:id="3" w:name="_Toc180520468"/>
-      <w:bookmarkStart w:id="4" w:name="_Toc152279527"/>
-      <w:bookmarkStart w:id="5" w:name="_Toc199238092"/>
+      <w:bookmarkStart w:id="4" w:name="_Toc199238092"/>
+      <w:bookmarkStart w:id="5" w:name="_Toc152279527"/>
       <w:r>
         <w:rPr>
           <w:rFonts w:cs="Arial"/>
@@ -5353,7 +5353,7 @@
       <w:bookmarkEnd w:id="1"/>
       <w:bookmarkEnd w:id="2"/>
       <w:bookmarkEnd w:id="3"/>
-      <w:bookmarkEnd w:id="5"/>
+      <w:bookmarkEnd w:id="4"/>
     </w:p>
     <w:p/>
     <w:p>
@@ -5726,7 +5726,7 @@
       <w:bookmarkStart w:id="7" w:name="_Toc152279528"/>
       <w:bookmarkStart w:id="8" w:name="_Toc180520469"/>
       <w:bookmarkStart w:id="9" w:name="_Toc199238093"/>
-      <w:bookmarkEnd w:id="4"/>
+      <w:bookmarkEnd w:id="5"/>
       <w:r>
         <w:rPr>
           <w:rFonts w:cs="Arial"/>
@@ -7631,6 +7631,10 @@
         <w:spacing w:line="360" w:lineRule="auto"/>
         <w:ind w:firstLine="567"/>
         <w:jc w:val="both"/>
+        <w:rPr>
+          <w:b/>
+          <w:bCs/>
+        </w:rPr>
       </w:pPr>
       <w:r>
         <w:rPr>
@@ -7646,6 +7650,59 @@
         </w:rPr>
         <w:t>:</w:t>
       </w:r>
+    </w:p>
+    <w:p>
+      <w:pPr>
+        <w:pStyle w:val="PargrafodaLista"/>
+        <w:numPr>
+          <w:ilvl w:val="0"/>
+          <w:numId w:val="41"/>
+        </w:numPr>
+        <w:spacing w:line="360" w:lineRule="auto"/>
+        <w:jc w:val="both"/>
+        <w:rPr>
+          <w:i/>
+          <w:iCs/>
+        </w:rPr>
+      </w:pPr>
+      <w:r>
+        <w:rPr>
+          <w:i/>
+          <w:iCs/>
+        </w:rPr>
+        <w:t>Leaderboard</w:t>
+      </w:r>
+    </w:p>
+    <w:p>
+      <w:pPr>
+        <w:pStyle w:val="PargrafodaLista"/>
+        <w:numPr>
+          <w:ilvl w:val="1"/>
+          <w:numId w:val="41"/>
+        </w:numPr>
+        <w:spacing w:line="360" w:lineRule="auto"/>
+        <w:jc w:val="both"/>
+      </w:pPr>
+      <w:r>
+        <w:t xml:space="preserve">É possível guardar a tua melhor pontuação e competir com outros jogadores, iniciando sessão com a conta </w:t>
+      </w:r>
+      <w:r>
+        <w:rPr>
+          <w:i/>
+          <w:iCs/>
+        </w:rPr>
+        <w:t>Google</w:t>
+      </w:r>
+      <w:r>
+        <w:t>!</w:t>
+      </w:r>
+    </w:p>
+    <w:p>
+      <w:pPr>
+        <w:spacing w:line="360" w:lineRule="auto"/>
+        <w:ind w:firstLine="567"/>
+        <w:jc w:val="both"/>
+      </w:pPr>
     </w:p>
     <w:p>
       <w:pPr>
@@ -7996,10 +8053,7 @@
         <w:t>.</w:t>
       </w:r>
       <w:r>
-        <w:t xml:space="preserve"> </w:t>
-      </w:r>
-      <w:r>
-        <w:t>Ao longo do desenvolvimento, foram aplicados conceitos fundamentais da computação gráfica, como modelação 3D, iluminação, texturização</w:t>
+        <w:t xml:space="preserve"> Ao longo do desenvolvimento, foram aplicados conceitos fundamentais da computação gráfica, como modelação 3D, iluminação, texturização</w:t>
       </w:r>
       <w:r>
         <w:t xml:space="preserve"> e</w:t>
@@ -8071,13 +8125,7 @@
         <w:jc w:val="both"/>
       </w:pPr>
       <w:r>
-        <w:t xml:space="preserve">Em suma, este projeto demonstra como a computação gráfica, aliada à criatividade, pode ser usada para desenvolver experiências digitais </w:t>
-      </w:r>
-      <w:r>
-        <w:t>divertidas</w:t>
-      </w:r>
-      <w:r>
-        <w:t>.</w:t>
+        <w:t>Em suma, este projeto demonstra como a computação gráfica, aliada à criatividade, pode ser usada para desenvolver experiências digitais divertidas.</w:t>
       </w:r>
       <w:bookmarkEnd w:id="22"/>
       <w:r>
@@ -8087,8 +8135,8 @@
         <w:br w:type="page"/>
       </w:r>
     </w:p>
-    <w:bookmarkStart w:id="25" w:name="_Toc199238099" w:displacedByCustomXml="next"/>
-    <w:bookmarkStart w:id="26" w:name="_Toc180520475" w:displacedByCustomXml="next"/>
+    <w:bookmarkStart w:id="25" w:name="_Toc180520475" w:displacedByCustomXml="next"/>
+    <w:bookmarkStart w:id="26" w:name="_Toc199238099" w:displacedByCustomXml="next"/>
     <w:sdt>
       <w:sdtPr>
         <w:rPr>
@@ -8131,7 +8179,7 @@
             </w:rPr>
             <w:t>Bibliografi</w:t>
           </w:r>
-          <w:bookmarkEnd w:id="26"/>
+          <w:bookmarkEnd w:id="25"/>
           <w:r>
             <w:rPr>
               <w:rFonts w:cs="Arial"/>
@@ -8142,7 +8190,7 @@
         </w:p>
       </w:sdtContent>
     </w:sdt>
-    <w:bookmarkEnd w:id="25" w:displacedByCustomXml="prev"/>
+    <w:bookmarkEnd w:id="26" w:displacedByCustomXml="prev"/>
     <w:p>
       <w:pPr>
         <w:ind w:firstLine="567"/>
@@ -14849,6 +14897,7 @@
   <w:style w:type="character" w:default="1" w:styleId="Tipodeletrapredefinidodopargrafo">
     <w:name w:val="Default Paragraph Font"/>
     <w:uiPriority w:val="1"/>
+    <w:semiHidden/>
     <w:unhideWhenUsed/>
   </w:style>
   <w:style w:type="table" w:default="1" w:styleId="Tabelanormal">

</xml_diff>